<commit_message>
Repo limk and Live pages
</commit_message>
<xml_diff>
--- a/docs/african-context-report.docx
+++ b/docs/african-context-report.docx
@@ -341,15 +341,7 @@
                 <w:sz w:val="24"/>
                 <w:szCs w:val="24"/>
               </w:rPr>
-              <w:t>S</w:t>
-            </w:r>
-            <w:r>
-              <w:rPr>
-                <w:rFonts w:ascii="Calibri" w:eastAsia="Times New Roman" w:hAnsi="Calibri" w:cs="Calibri"/>
-                <w:sz w:val="24"/>
-                <w:szCs w:val="24"/>
-              </w:rPr>
-              <w:t>f1</w:t>
+              <w:t>Sf1</w:t>
             </w:r>
           </w:p>
         </w:tc>
@@ -780,6 +772,13 @@
     </w:p>
     <w:sdt>
       <w:sdtPr>
+        <w:rPr>
+          <w:rFonts w:ascii="Times New Roman" w:eastAsia="Times New Roman" w:hAnsi="Times New Roman" w:cs="Times New Roman"/>
+          <w:color w:val="auto"/>
+          <w:sz w:val="20"/>
+          <w:szCs w:val="20"/>
+          <w:lang w:val="en-ZA" w:eastAsia="en-ZA"/>
+        </w:rPr>
         <w:id w:val="-1532261426"/>
         <w:docPartObj>
           <w:docPartGallery w:val="Table of Contents"/>
@@ -788,14 +787,9 @@
       </w:sdtPr>
       <w:sdtEndPr>
         <w:rPr>
-          <w:rFonts w:ascii="Times New Roman" w:eastAsia="Times New Roman" w:hAnsi="Times New Roman" w:cs="Times New Roman"/>
           <w:b/>
           <w:bCs/>
           <w:noProof/>
-          <w:color w:val="auto"/>
-          <w:sz w:val="20"/>
-          <w:szCs w:val="20"/>
-          <w:lang w:val="en-ZA" w:eastAsia="en-ZA"/>
         </w:rPr>
       </w:sdtEndPr>
       <w:sdtContent>
@@ -2066,14 +2060,103 @@
         <w:pStyle w:val="Heading1"/>
         <w:rPr>
           <w:rFonts w:eastAsia="Calibri"/>
+          <w:b/>
+          <w:bCs/>
+          <w:color w:val="EE0000"/>
+          <w:u w:val="single"/>
         </w:rPr>
       </w:pPr>
       <w:bookmarkStart w:id="3" w:name="_Toc241508277"/>
       <w:r>
         <w:rPr>
           <w:rFonts w:eastAsia="Calibri"/>
+          <w:b/>
+          <w:bCs/>
+          <w:color w:val="EE0000"/>
+          <w:u w:val="single"/>
         </w:rPr>
         <w:lastRenderedPageBreak/>
+        <w:t>Live Pages Link and GitHub Repo Link</w:t>
+      </w:r>
+    </w:p>
+    <w:p>
+      <w:pPr>
+        <w:pStyle w:val="Heading1"/>
+        <w:rPr>
+          <w:rFonts w:eastAsia="Calibri"/>
+          <w:b/>
+          <w:bCs/>
+          <w:color w:val="EE0000"/>
+          <w:u w:val="single"/>
+        </w:rPr>
+      </w:pPr>
+    </w:p>
+    <w:p>
+      <w:pPr>
+        <w:pStyle w:val="ListParagraph"/>
+        <w:numPr>
+          <w:ilvl w:val="0"/>
+          <w:numId w:val="8"/>
+        </w:numPr>
+        <w:rPr>
+          <w:rFonts w:asciiTheme="minorHAnsi" w:eastAsia="Calibri" w:hAnsiTheme="minorHAnsi" w:cstheme="minorHAnsi"/>
+          <w:sz w:val="22"/>
+          <w:szCs w:val="22"/>
+        </w:rPr>
+      </w:pPr>
+      <w:hyperlink r:id="rId7" w:history="1">
+        <w:r>
+          <w:rPr>
+            <w:rStyle w:val="Hyperlink"/>
+            <w:rFonts w:asciiTheme="minorHAnsi" w:eastAsia="Calibri" w:hAnsiTheme="minorHAnsi" w:cstheme="minorHAnsi"/>
+            <w:sz w:val="22"/>
+            <w:szCs w:val="22"/>
+          </w:rPr>
+          <w:t>https://github.com/Nathan-4918/EcoDash-African-Logistics.git</w:t>
+        </w:r>
+      </w:hyperlink>
+    </w:p>
+    <w:p>
+      <w:pPr>
+        <w:pStyle w:val="ListParagraph"/>
+        <w:numPr>
+          <w:ilvl w:val="0"/>
+          <w:numId w:val="8"/>
+        </w:numPr>
+        <w:rPr>
+          <w:rFonts w:asciiTheme="minorHAnsi" w:eastAsia="Calibri" w:hAnsiTheme="minorHAnsi" w:cstheme="minorHAnsi"/>
+          <w:sz w:val="22"/>
+          <w:szCs w:val="22"/>
+        </w:rPr>
+      </w:pPr>
+      <w:r>
+        <w:rPr>
+          <w:rFonts w:asciiTheme="minorHAnsi" w:eastAsia="Calibri" w:hAnsiTheme="minorHAnsi" w:cstheme="minorHAnsi"/>
+          <w:sz w:val="22"/>
+          <w:szCs w:val="22"/>
+        </w:rPr>
+        <w:t>https://nathan-4918.github.io/EcoDash-African-Logistics/</w:t>
+      </w:r>
+    </w:p>
+    <w:p>
+      <w:pPr>
+        <w:pStyle w:val="Heading1"/>
+        <w:rPr>
+          <w:rFonts w:eastAsia="Calibri"/>
+        </w:rPr>
+      </w:pPr>
+    </w:p>
+    <w:p>
+      <w:pPr>
+        <w:pStyle w:val="Heading1"/>
+        <w:rPr>
+          <w:rFonts w:eastAsia="Calibri"/>
+        </w:rPr>
+      </w:pPr>
+      <w:r>
+        <w:rPr>
+          <w:rFonts w:eastAsia="Calibri"/>
+        </w:rPr>
         <w:t>References</w:t>
       </w:r>
       <w:bookmarkEnd w:id="3"/>
@@ -2116,15 +2199,7 @@
           <w:sz w:val="22"/>
           <w:szCs w:val="22"/>
         </w:rPr>
-        <w:t>: Impact on sectors - 29 MARCH 2023. (2023). (). London: Fitch Solutions Group Limited. Retrieved from ProQuest One Academic Retrieved from https://www.proquest.com/reports/load-shedding-south-africa-impact-on-sectors-29/docview/2792124064/se-2</w:t>
-      </w:r>
-      <w:r>
-        <w:rPr>
-          <w:rFonts w:ascii="Calibri" w:eastAsia="Calibri" w:hAnsi="Calibri" w:cs="Calibri"/>
-          <w:sz w:val="22"/>
-          <w:szCs w:val="22"/>
-        </w:rPr>
-        <w:t xml:space="preserve"> </w:t>
+        <w:t xml:space="preserve">: Impact on sectors - 29 MARCH 2023. (2023). (). London: Fitch Solutions Group Limited. Retrieved from ProQuest One Academic Retrieved from https://www.proquest.com/reports/load-shedding-south-africa-impact-on-sectors-29/docview/2792124064/se-2 </w:t>
       </w:r>
     </w:p>
     <w:p>
@@ -2648,6 +2723,119 @@
     </w:lvl>
   </w:abstractNum>
   <w:abstractNum w:abstractNumId="4" w15:restartNumberingAfterBreak="0">
+    <w:nsid w:val="256B3A42"/>
+    <w:multiLevelType w:val="hybridMultilevel"/>
+    <w:tmpl w:val="82F0BD38"/>
+    <w:lvl w:ilvl="0" w:tplc="1C090001">
+      <w:start w:val="1"/>
+      <w:numFmt w:val="bullet"/>
+      <w:lvlText w:val=""/>
+      <w:lvlJc w:val="left"/>
+      <w:pPr>
+        <w:ind w:left="720" w:hanging="360"/>
+      </w:pPr>
+      <w:rPr>
+        <w:rFonts w:ascii="Symbol" w:hAnsi="Symbol" w:hint="default"/>
+      </w:rPr>
+    </w:lvl>
+    <w:lvl w:ilvl="1" w:tplc="1C090003" w:tentative="1">
+      <w:start w:val="1"/>
+      <w:numFmt w:val="bullet"/>
+      <w:lvlText w:val="o"/>
+      <w:lvlJc w:val="left"/>
+      <w:pPr>
+        <w:ind w:left="1440" w:hanging="360"/>
+      </w:pPr>
+      <w:rPr>
+        <w:rFonts w:ascii="Courier New" w:hAnsi="Courier New" w:cs="Courier New" w:hint="default"/>
+      </w:rPr>
+    </w:lvl>
+    <w:lvl w:ilvl="2" w:tplc="1C090005" w:tentative="1">
+      <w:start w:val="1"/>
+      <w:numFmt w:val="bullet"/>
+      <w:lvlText w:val=""/>
+      <w:lvlJc w:val="left"/>
+      <w:pPr>
+        <w:ind w:left="2160" w:hanging="360"/>
+      </w:pPr>
+      <w:rPr>
+        <w:rFonts w:ascii="Wingdings" w:hAnsi="Wingdings" w:hint="default"/>
+      </w:rPr>
+    </w:lvl>
+    <w:lvl w:ilvl="3" w:tplc="1C090001" w:tentative="1">
+      <w:start w:val="1"/>
+      <w:numFmt w:val="bullet"/>
+      <w:lvlText w:val=""/>
+      <w:lvlJc w:val="left"/>
+      <w:pPr>
+        <w:ind w:left="2880" w:hanging="360"/>
+      </w:pPr>
+      <w:rPr>
+        <w:rFonts w:ascii="Symbol" w:hAnsi="Symbol" w:hint="default"/>
+      </w:rPr>
+    </w:lvl>
+    <w:lvl w:ilvl="4" w:tplc="1C090003" w:tentative="1">
+      <w:start w:val="1"/>
+      <w:numFmt w:val="bullet"/>
+      <w:lvlText w:val="o"/>
+      <w:lvlJc w:val="left"/>
+      <w:pPr>
+        <w:ind w:left="3600" w:hanging="360"/>
+      </w:pPr>
+      <w:rPr>
+        <w:rFonts w:ascii="Courier New" w:hAnsi="Courier New" w:cs="Courier New" w:hint="default"/>
+      </w:rPr>
+    </w:lvl>
+    <w:lvl w:ilvl="5" w:tplc="1C090005" w:tentative="1">
+      <w:start w:val="1"/>
+      <w:numFmt w:val="bullet"/>
+      <w:lvlText w:val=""/>
+      <w:lvlJc w:val="left"/>
+      <w:pPr>
+        <w:ind w:left="4320" w:hanging="360"/>
+      </w:pPr>
+      <w:rPr>
+        <w:rFonts w:ascii="Wingdings" w:hAnsi="Wingdings" w:hint="default"/>
+      </w:rPr>
+    </w:lvl>
+    <w:lvl w:ilvl="6" w:tplc="1C090001" w:tentative="1">
+      <w:start w:val="1"/>
+      <w:numFmt w:val="bullet"/>
+      <w:lvlText w:val=""/>
+      <w:lvlJc w:val="left"/>
+      <w:pPr>
+        <w:ind w:left="5040" w:hanging="360"/>
+      </w:pPr>
+      <w:rPr>
+        <w:rFonts w:ascii="Symbol" w:hAnsi="Symbol" w:hint="default"/>
+      </w:rPr>
+    </w:lvl>
+    <w:lvl w:ilvl="7" w:tplc="1C090003" w:tentative="1">
+      <w:start w:val="1"/>
+      <w:numFmt w:val="bullet"/>
+      <w:lvlText w:val="o"/>
+      <w:lvlJc w:val="left"/>
+      <w:pPr>
+        <w:ind w:left="5760" w:hanging="360"/>
+      </w:pPr>
+      <w:rPr>
+        <w:rFonts w:ascii="Courier New" w:hAnsi="Courier New" w:cs="Courier New" w:hint="default"/>
+      </w:rPr>
+    </w:lvl>
+    <w:lvl w:ilvl="8" w:tplc="1C090005" w:tentative="1">
+      <w:start w:val="1"/>
+      <w:numFmt w:val="bullet"/>
+      <w:lvlText w:val=""/>
+      <w:lvlJc w:val="left"/>
+      <w:pPr>
+        <w:ind w:left="6480" w:hanging="360"/>
+      </w:pPr>
+      <w:rPr>
+        <w:rFonts w:ascii="Wingdings" w:hAnsi="Wingdings" w:hint="default"/>
+      </w:rPr>
+    </w:lvl>
+  </w:abstractNum>
+  <w:abstractNum w:abstractNumId="5" w15:restartNumberingAfterBreak="0">
     <w:nsid w:val="44FE746E"/>
     <w:multiLevelType w:val="hybridMultilevel"/>
     <w:tmpl w:val="E2FED85E"/>
@@ -2760,7 +2948,7 @@
       </w:rPr>
     </w:lvl>
   </w:abstractNum>
-  <w:abstractNum w:abstractNumId="5" w15:restartNumberingAfterBreak="0">
+  <w:abstractNum w:abstractNumId="6" w15:restartNumberingAfterBreak="0">
     <w:nsid w:val="548E0A55"/>
     <w:multiLevelType w:val="hybridMultilevel"/>
     <w:tmpl w:val="B942D27A"/>
@@ -2846,7 +3034,7 @@
       </w:pPr>
     </w:lvl>
   </w:abstractNum>
-  <w:abstractNum w:abstractNumId="6" w15:restartNumberingAfterBreak="0">
+  <w:abstractNum w:abstractNumId="7" w15:restartNumberingAfterBreak="0">
     <w:nsid w:val="605B5F10"/>
     <w:multiLevelType w:val="hybridMultilevel"/>
     <w:tmpl w:val="71B23CC6"/>
@@ -2960,13 +3148,13 @@
     </w:lvl>
   </w:abstractNum>
   <w:num w:numId="1" w16cid:durableId="1203010640">
-    <w:abstractNumId w:val="5"/>
+    <w:abstractNumId w:val="6"/>
     <w:lvlOverride w:ilvl="0">
       <w:startOverride w:val="1"/>
     </w:lvlOverride>
   </w:num>
   <w:num w:numId="2" w16cid:durableId="606471155">
-    <w:abstractNumId w:val="4"/>
+    <w:abstractNumId w:val="5"/>
   </w:num>
   <w:num w:numId="3" w16cid:durableId="356197852">
     <w:abstractNumId w:val="2"/>
@@ -2981,7 +3169,10 @@
     <w:abstractNumId w:val="1"/>
   </w:num>
   <w:num w:numId="7" w16cid:durableId="1872641543">
-    <w:abstractNumId w:val="6"/>
+    <w:abstractNumId w:val="7"/>
+  </w:num>
+  <w:num w:numId="8" w16cid:durableId="507911377">
+    <w:abstractNumId w:val="4"/>
   </w:num>
 </w:numbering>
 </file>
@@ -3628,6 +3819,18 @@
       <w:spacing w:after="100"/>
     </w:pPr>
   </w:style>
+  <w:style w:type="character" w:styleId="UnresolvedMention">
+    <w:name w:val="Unresolved Mention"/>
+    <w:basedOn w:val="DefaultParagraphFont"/>
+    <w:uiPriority w:val="99"/>
+    <w:semiHidden/>
+    <w:unhideWhenUsed/>
+    <w:rsid w:val="00D47345"/>
+    <w:rPr>
+      <w:color w:val="605E5C"/>
+      <w:shd w:val="clear" w:color="auto" w:fill="E1DFDD"/>
+    </w:rPr>
+  </w:style>
 </w:styles>
 </file>
 

</xml_diff>